<commit_message>
Updated Help Desk system with unified schema and new features
</commit_message>
<xml_diff>
--- a/Media/IT_Service_Ticket_Template.docx
+++ b/Media/IT_Service_Ticket_Template.docx
@@ -273,16 +273,7 @@
                 <w:sz w:val="22"/>
                 <w:szCs w:val="22"/>
               </w:rPr>
-              <w:t>Time</w:t>
-            </w:r>
-            <w:proofErr w:type="gramStart"/>
-            <w:r>
-              <w:rPr>
-                <w:rFonts w:ascii="Cambria" w:hAnsi="Cambria"/>
-                <w:sz w:val="22"/>
-                <w:szCs w:val="22"/>
-              </w:rPr>
-              <w:t>:</w:t>
+              <w:t>Time:</w:t>
             </w:r>
             <w:r>
               <w:rPr>
@@ -298,16 +289,7 @@
                 <w:sz w:val="22"/>
                 <w:szCs w:val="22"/>
               </w:rPr>
-              <w:t xml:space="preserve"> {</w:t>
-            </w:r>
-            <w:proofErr w:type="gramEnd"/>
-            <w:r>
-              <w:rPr>
-                <w:rFonts w:ascii="Cambria" w:hAnsi="Cambria"/>
-                <w:sz w:val="22"/>
-                <w:szCs w:val="22"/>
-              </w:rPr>
-              <w:t>{time}}</w:t>
+              <w:t>{{time}}</w:t>
             </w:r>
           </w:p>
         </w:tc>
@@ -463,7 +445,23 @@
                 <w:sz w:val="22"/>
                 <w:szCs w:val="22"/>
               </w:rPr>
-              <w:t xml:space="preserve"> {</w:t>
+              <w:t xml:space="preserve"> </w:t>
+            </w:r>
+            <w:r>
+              <w:rPr>
+                <w:rFonts w:ascii="Cambria" w:hAnsi="Cambria"/>
+                <w:sz w:val="22"/>
+                <w:szCs w:val="22"/>
+              </w:rPr>
+              <w:t>{</w:t>
+            </w:r>
+            <w:r>
+              <w:rPr>
+                <w:rFonts w:ascii="Cambria" w:hAnsi="Cambria"/>
+                <w:sz w:val="22"/>
+                <w:szCs w:val="22"/>
+              </w:rPr>
+              <w:t>{</w:t>
             </w:r>
             <w:proofErr w:type="spellStart"/>
             <w:r>
@@ -627,14 +625,13 @@
               </w:rPr>
               <w:t xml:space="preserve">Date and time received: </w:t>
             </w:r>
-            <w:proofErr w:type="gramStart"/>
-            <w:r>
-              <w:rPr>
-                <w:rFonts w:ascii="Cambria" w:hAnsi="Cambria"/>
-                <w:sz w:val="22"/>
-                <w:szCs w:val="22"/>
-              </w:rPr>
-              <w:t xml:space="preserve">{{ </w:t>
+            <w:r>
+              <w:rPr>
+                <w:rFonts w:ascii="Cambria" w:hAnsi="Cambria"/>
+                <w:sz w:val="22"/>
+                <w:szCs w:val="22"/>
+              </w:rPr>
+              <w:t>{{</w:t>
             </w:r>
             <w:proofErr w:type="spellStart"/>
             <w:r>
@@ -643,16 +640,7 @@
                 <w:sz w:val="22"/>
                 <w:szCs w:val="22"/>
               </w:rPr>
-              <w:t>date</w:t>
-            </w:r>
-            <w:proofErr w:type="gramEnd"/>
-            <w:r>
-              <w:rPr>
-                <w:rFonts w:ascii="Cambria" w:hAnsi="Cambria"/>
-                <w:sz w:val="22"/>
-                <w:szCs w:val="22"/>
-              </w:rPr>
-              <w:t>_recieved</w:t>
+              <w:t>date_recieved</w:t>
             </w:r>
             <w:proofErr w:type="spellEnd"/>
             <w:r>
@@ -1425,16 +1413,7 @@
                 <w:sz w:val="22"/>
                 <w:szCs w:val="22"/>
               </w:rPr>
-              <w:t xml:space="preserve"> </w:t>
-            </w:r>
-            <w:proofErr w:type="gramStart"/>
-            <w:r>
-              <w:rPr>
-                <w:rFonts w:ascii="Cambria" w:hAnsi="Cambria"/>
-                <w:sz w:val="22"/>
-                <w:szCs w:val="22"/>
-              </w:rPr>
-              <w:t xml:space="preserve">{{ </w:t>
+              <w:t xml:space="preserve"> {{</w:t>
             </w:r>
             <w:proofErr w:type="spellStart"/>
             <w:r>
@@ -1443,16 +1422,7 @@
                 <w:sz w:val="22"/>
                 <w:szCs w:val="22"/>
               </w:rPr>
-              <w:t>date</w:t>
-            </w:r>
-            <w:proofErr w:type="gramEnd"/>
-            <w:r>
-              <w:rPr>
-                <w:rFonts w:ascii="Cambria" w:hAnsi="Cambria"/>
-                <w:sz w:val="22"/>
-                <w:szCs w:val="22"/>
-              </w:rPr>
-              <w:t>_resolved</w:t>
+              <w:t>date_resolved</w:t>
             </w:r>
             <w:proofErr w:type="spellEnd"/>
             <w:r>

</xml_diff>